<commit_message>
add analysis for RAG few shot cot e2p
</commit_message>
<xml_diff>
--- a/1-BaselineTest/Models Responses/REports/Brown et al.docx
+++ b/1-BaselineTest/Models Responses/REports/Brown et al.docx
@@ -63,6 +63,7 @@
     <w:p>
       <w:pPr>
         <w:pStyle w:val="ListParagraph"/>
+        <w:bidi w:val="0"/>
         <w:rPr>
           <w:lang w:bidi="fa-IR"/>
         </w:rPr>
@@ -90,6 +91,7 @@
     <w:p>
       <w:pPr>
         <w:pStyle w:val="ListParagraph"/>
+        <w:bidi w:val="0"/>
         <w:rPr>
           <w:lang w:bidi="fa-IR"/>
         </w:rPr>
@@ -124,6 +126,7 @@
     </w:p>
     <w:p>
       <w:pPr>
+        <w:bidi w:val="0"/>
         <w:rPr>
           <w:lang w:bidi="fa-IR"/>
         </w:rPr>
@@ -151,6 +154,7 @@
     <w:p>
       <w:pPr>
         <w:pStyle w:val="ListParagraph"/>
+        <w:bidi w:val="0"/>
         <w:rPr>
           <w:lang w:bidi="fa-IR"/>
         </w:rPr>
@@ -178,6 +182,7 @@
     <w:p>
       <w:pPr>
         <w:pStyle w:val="ListParagraph"/>
+        <w:bidi w:val="0"/>
         <w:rPr>
           <w:lang w:bidi="fa-IR"/>
         </w:rPr>
@@ -205,6 +210,7 @@
     <w:p>
       <w:pPr>
         <w:pStyle w:val="ListParagraph"/>
+        <w:bidi w:val="0"/>
         <w:rPr>
           <w:lang w:bidi="fa-IR"/>
         </w:rPr>
@@ -224,14 +230,35 @@
       </w:pPr>
       <w:r>
         <w:rPr>
-          <w:lang w:bidi="fa-IR"/>
-        </w:rPr>
-        <w:t>Chain-of-Thought Prompting Elicits Reasoning in Large Language Models</w:t>
-      </w:r>
-    </w:p>
-    <w:p>
-      <w:pPr>
-        <w:pStyle w:val="ListParagraph"/>
+          <w:i/>
+          <w:iCs/>
+          <w:lang w:bidi="fa-IR"/>
+        </w:rPr>
+        <w:t>J. Wei et al., "Chain-of-Thought Prompting Elicits Reasoning in Large Language Models," Advances in Neural Information Processing Systems (</w:t>
+      </w:r>
+      <w:proofErr w:type="spellStart"/>
+      <w:r>
+        <w:rPr>
+          <w:i/>
+          <w:iCs/>
+          <w:lang w:bidi="fa-IR"/>
+        </w:rPr>
+        <w:t>NeurIPS</w:t>
+      </w:r>
+      <w:proofErr w:type="spellEnd"/>
+      <w:r>
+        <w:rPr>
+          <w:i/>
+          <w:iCs/>
+          <w:lang w:bidi="fa-IR"/>
+        </w:rPr>
+        <w:t>), vol. 35, pp. 24824–24837, 2022.</w:t>
+      </w:r>
+    </w:p>
+    <w:p>
+      <w:pPr>
+        <w:pStyle w:val="ListParagraph"/>
+        <w:bidi w:val="0"/>
         <w:jc w:val="right"/>
         <w:rPr>
           <w:lang w:bidi="fa-IR"/>
@@ -260,6 +287,7 @@
     <w:p>
       <w:pPr>
         <w:pStyle w:val="ListParagraph"/>
+        <w:bidi w:val="0"/>
         <w:rPr>
           <w:lang w:bidi="fa-IR"/>
         </w:rPr>
@@ -287,6 +315,7 @@
     <w:p>
       <w:pPr>
         <w:pStyle w:val="ListParagraph"/>
+        <w:bidi w:val="0"/>
         <w:rPr>
           <w:lang w:bidi="fa-IR"/>
         </w:rPr>
@@ -314,6 +343,7 @@
     <w:p>
       <w:pPr>
         <w:pStyle w:val="ListParagraph"/>
+        <w:bidi w:val="0"/>
         <w:rPr>
           <w:lang w:bidi="fa-IR"/>
         </w:rPr>
@@ -341,6 +371,7 @@
     <w:p>
       <w:pPr>
         <w:pStyle w:val="ListParagraph"/>
+        <w:bidi w:val="0"/>
         <w:rPr>
           <w:lang w:bidi="fa-IR"/>
         </w:rPr>
@@ -382,6 +413,7 @@
     <w:p>
       <w:pPr>
         <w:pStyle w:val="ListParagraph"/>
+        <w:bidi w:val="0"/>
         <w:rPr>
           <w:lang w:bidi="fa-IR"/>
         </w:rPr>
@@ -409,6 +441,7 @@
     <w:p>
       <w:pPr>
         <w:pStyle w:val="ListParagraph"/>
+        <w:bidi w:val="0"/>
         <w:rPr>
           <w:lang w:bidi="fa-IR"/>
         </w:rPr>
@@ -439,6 +472,1236 @@
           <w:lang w:bidi="fa-IR"/>
         </w:rPr>
         <w:t xml:space="preserve"> et al., 2022 – Solving Quantitative Reasoning Problems...</w:t>
+      </w:r>
+    </w:p>
+    <w:p>
+      <w:pPr>
+        <w:pStyle w:val="ListParagraph"/>
+        <w:bidi w:val="0"/>
+        <w:rPr>
+          <w:lang w:bidi="fa-IR"/>
+        </w:rPr>
+      </w:pPr>
+    </w:p>
+    <w:p>
+      <w:pPr>
+        <w:pStyle w:val="ListParagraph"/>
+        <w:numPr>
+          <w:ilvl w:val="0"/>
+          <w:numId w:val="22"/>
+        </w:numPr>
+        <w:bidi w:val="0"/>
+        <w:rPr>
+          <w:lang w:bidi="fa-IR"/>
+        </w:rPr>
+      </w:pPr>
+      <w:r>
+        <w:rPr>
+          <w:lang w:bidi="fa-IR"/>
+        </w:rPr>
+        <w:t>M. J. Dahl </w:t>
+      </w:r>
+      <w:r>
+        <w:rPr>
+          <w:i/>
+          <w:iCs/>
+          <w:lang w:bidi="fa-IR"/>
+        </w:rPr>
+        <w:t>et al.</w:t>
+      </w:r>
+      <w:r>
+        <w:rPr>
+          <w:lang w:bidi="fa-IR"/>
+        </w:rPr>
+        <w:t>, "Large Legal Fictions: Profiling Legal Hallucinations in Large Language Models," </w:t>
+      </w:r>
+      <w:proofErr w:type="spellStart"/>
+      <w:r>
+        <w:rPr>
+          <w:i/>
+          <w:iCs/>
+          <w:lang w:bidi="fa-IR"/>
+        </w:rPr>
+        <w:t>arXiv</w:t>
+      </w:r>
+      <w:proofErr w:type="spellEnd"/>
+      <w:r>
+        <w:rPr>
+          <w:i/>
+          <w:iCs/>
+          <w:lang w:bidi="fa-IR"/>
+        </w:rPr>
+        <w:t xml:space="preserve"> preprint arXiv:2401.01301</w:t>
+      </w:r>
+      <w:r>
+        <w:rPr>
+          <w:lang w:bidi="fa-IR"/>
+        </w:rPr>
+        <w:t>, 2024.</w:t>
+      </w:r>
+    </w:p>
+    <w:p>
+      <w:pPr>
+        <w:pStyle w:val="ListParagraph"/>
+        <w:bidi w:val="0"/>
+        <w:rPr>
+          <w:lang w:bidi="fa-IR"/>
+        </w:rPr>
+      </w:pPr>
+    </w:p>
+    <w:p>
+      <w:pPr>
+        <w:pStyle w:val="ListParagraph"/>
+        <w:numPr>
+          <w:ilvl w:val="0"/>
+          <w:numId w:val="22"/>
+        </w:numPr>
+        <w:bidi w:val="0"/>
+        <w:rPr>
+          <w:lang w:bidi="fa-IR"/>
+        </w:rPr>
+      </w:pPr>
+      <w:r>
+        <w:rPr>
+          <w:lang w:bidi="fa-IR"/>
+        </w:rPr>
+        <w:t>Y. Huang </w:t>
+      </w:r>
+      <w:r>
+        <w:rPr>
+          <w:i/>
+          <w:iCs/>
+          <w:lang w:bidi="fa-IR"/>
+        </w:rPr>
+        <w:t>et al.</w:t>
+      </w:r>
+      <w:r>
+        <w:rPr>
+          <w:lang w:bidi="fa-IR"/>
+        </w:rPr>
+        <w:t>, "Fine-tuning Large Language Models for Improving Factuality in Legal Question Answering," </w:t>
+      </w:r>
+      <w:proofErr w:type="spellStart"/>
+      <w:r>
+        <w:rPr>
+          <w:i/>
+          <w:iCs/>
+          <w:lang w:bidi="fa-IR"/>
+        </w:rPr>
+        <w:t>arXiv</w:t>
+      </w:r>
+      <w:proofErr w:type="spellEnd"/>
+      <w:r>
+        <w:rPr>
+          <w:i/>
+          <w:iCs/>
+          <w:lang w:bidi="fa-IR"/>
+        </w:rPr>
+        <w:t xml:space="preserve"> preprint arXiv:2501.06521</w:t>
+      </w:r>
+      <w:r>
+        <w:rPr>
+          <w:lang w:bidi="fa-IR"/>
+        </w:rPr>
+        <w:t>, 2025.</w:t>
+      </w:r>
+    </w:p>
+    <w:p>
+      <w:pPr>
+        <w:pStyle w:val="ListParagraph"/>
+        <w:bidi w:val="0"/>
+        <w:rPr>
+          <w:lang w:bidi="fa-IR"/>
+        </w:rPr>
+      </w:pPr>
+    </w:p>
+    <w:p>
+      <w:pPr>
+        <w:pStyle w:val="ListParagraph"/>
+        <w:numPr>
+          <w:ilvl w:val="0"/>
+          <w:numId w:val="22"/>
+        </w:numPr>
+        <w:bidi w:val="0"/>
+        <w:rPr>
+          <w:lang w:bidi="fa-IR"/>
+        </w:rPr>
+      </w:pPr>
+      <w:r>
+        <w:rPr>
+          <w:lang w:bidi="fa-IR"/>
+        </w:rPr>
+        <w:t>H. Zhang </w:t>
+      </w:r>
+      <w:r>
+        <w:rPr>
+          <w:i/>
+          <w:iCs/>
+          <w:lang w:bidi="fa-IR"/>
+        </w:rPr>
+        <w:t>et al.</w:t>
+      </w:r>
+      <w:r>
+        <w:rPr>
+          <w:lang w:bidi="fa-IR"/>
+        </w:rPr>
+        <w:t>, "Retrieve Only When It Needs: Adaptive Retrieval Augmentation for Hallucination Mitigation in Large Language Models," </w:t>
+      </w:r>
+      <w:proofErr w:type="spellStart"/>
+      <w:r>
+        <w:rPr>
+          <w:i/>
+          <w:iCs/>
+          <w:lang w:bidi="fa-IR"/>
+        </w:rPr>
+        <w:t>arXiv</w:t>
+      </w:r>
+      <w:proofErr w:type="spellEnd"/>
+      <w:r>
+        <w:rPr>
+          <w:i/>
+          <w:iCs/>
+          <w:lang w:bidi="fa-IR"/>
+        </w:rPr>
+        <w:t xml:space="preserve"> preprint arXiv:2402.10612</w:t>
+      </w:r>
+      <w:r>
+        <w:rPr>
+          <w:lang w:bidi="fa-IR"/>
+        </w:rPr>
+        <w:t>, 2024.</w:t>
+      </w:r>
+    </w:p>
+    <w:p>
+      <w:pPr>
+        <w:pStyle w:val="ListParagraph"/>
+        <w:bidi w:val="0"/>
+        <w:rPr>
+          <w:lang w:bidi="fa-IR"/>
+        </w:rPr>
+      </w:pPr>
+    </w:p>
+    <w:p>
+      <w:pPr>
+        <w:pStyle w:val="ListParagraph"/>
+        <w:numPr>
+          <w:ilvl w:val="0"/>
+          <w:numId w:val="22"/>
+        </w:numPr>
+        <w:bidi w:val="0"/>
+        <w:rPr>
+          <w:lang w:bidi="fa-IR"/>
+        </w:rPr>
+      </w:pPr>
+      <w:r>
+        <w:rPr>
+          <w:lang w:bidi="fa-IR"/>
+        </w:rPr>
+        <w:t>J. Nguyen </w:t>
+      </w:r>
+      <w:r>
+        <w:rPr>
+          <w:i/>
+          <w:iCs/>
+          <w:lang w:bidi="fa-IR"/>
+        </w:rPr>
+        <w:t>et al.</w:t>
+      </w:r>
+      <w:r>
+        <w:rPr>
+          <w:lang w:bidi="fa-IR"/>
+        </w:rPr>
+        <w:t>, "Methods for Legal Citation Prediction in the Age of LLMs: An Australian Law Case Study," </w:t>
+      </w:r>
+      <w:proofErr w:type="spellStart"/>
+      <w:r>
+        <w:rPr>
+          <w:i/>
+          <w:iCs/>
+          <w:lang w:bidi="fa-IR"/>
+        </w:rPr>
+        <w:t>arXiv</w:t>
+      </w:r>
+      <w:proofErr w:type="spellEnd"/>
+      <w:r>
+        <w:rPr>
+          <w:i/>
+          <w:iCs/>
+          <w:lang w:bidi="fa-IR"/>
+        </w:rPr>
+        <w:t xml:space="preserve"> preprint arXiv:2412.06272</w:t>
+      </w:r>
+      <w:r>
+        <w:rPr>
+          <w:lang w:bidi="fa-IR"/>
+        </w:rPr>
+        <w:t>, 2024.</w:t>
+      </w:r>
+    </w:p>
+    <w:p>
+      <w:pPr>
+        <w:pStyle w:val="ListParagraph"/>
+        <w:bidi w:val="0"/>
+        <w:rPr>
+          <w:lang w:bidi="fa-IR"/>
+        </w:rPr>
+      </w:pPr>
+    </w:p>
+    <w:p>
+      <w:pPr>
+        <w:pStyle w:val="ListParagraph"/>
+        <w:numPr>
+          <w:ilvl w:val="0"/>
+          <w:numId w:val="22"/>
+        </w:numPr>
+        <w:bidi w:val="0"/>
+        <w:rPr>
+          <w:lang w:bidi="fa-IR"/>
+        </w:rPr>
+      </w:pPr>
+      <w:r>
+        <w:rPr>
+          <w:lang w:bidi="fa-IR"/>
+        </w:rPr>
+        <w:t>X. Zhang </w:t>
+      </w:r>
+      <w:r>
+        <w:rPr>
+          <w:i/>
+          <w:iCs/>
+          <w:lang w:bidi="fa-IR"/>
+        </w:rPr>
+        <w:t>et al.</w:t>
+      </w:r>
+      <w:r>
+        <w:rPr>
+          <w:lang w:bidi="fa-IR"/>
+        </w:rPr>
+        <w:t>, "SEER: Self-Aligned Evidence Extraction for Retrieval-Augmented Generation," </w:t>
+      </w:r>
+      <w:proofErr w:type="spellStart"/>
+      <w:r>
+        <w:rPr>
+          <w:i/>
+          <w:iCs/>
+          <w:lang w:bidi="fa-IR"/>
+        </w:rPr>
+        <w:t>arXiv</w:t>
+      </w:r>
+      <w:proofErr w:type="spellEnd"/>
+      <w:r>
+        <w:rPr>
+          <w:i/>
+          <w:iCs/>
+          <w:lang w:bidi="fa-IR"/>
+        </w:rPr>
+        <w:t xml:space="preserve"> preprint arXiv:2410.11315</w:t>
+      </w:r>
+      <w:r>
+        <w:rPr>
+          <w:lang w:bidi="fa-IR"/>
+        </w:rPr>
+        <w:t>, 2024.</w:t>
+      </w:r>
+    </w:p>
+    <w:p>
+      <w:pPr>
+        <w:pStyle w:val="ListParagraph"/>
+        <w:bidi w:val="0"/>
+        <w:rPr>
+          <w:lang w:bidi="fa-IR"/>
+        </w:rPr>
+      </w:pPr>
+    </w:p>
+    <w:p>
+      <w:pPr>
+        <w:pStyle w:val="ListParagraph"/>
+        <w:numPr>
+          <w:ilvl w:val="0"/>
+          <w:numId w:val="22"/>
+        </w:numPr>
+        <w:bidi w:val="0"/>
+        <w:rPr>
+          <w:lang w:bidi="fa-IR"/>
+        </w:rPr>
+      </w:pPr>
+      <w:r>
+        <w:rPr>
+          <w:lang w:bidi="fa-IR"/>
+        </w:rPr>
+        <w:t>Y. Shi </w:t>
+      </w:r>
+      <w:r>
+        <w:rPr>
+          <w:i/>
+          <w:iCs/>
+          <w:lang w:bidi="fa-IR"/>
+        </w:rPr>
+        <w:t>et al.</w:t>
+      </w:r>
+      <w:r>
+        <w:rPr>
+          <w:lang w:bidi="fa-IR"/>
+        </w:rPr>
+        <w:t>, "Multi-view Content-aware Indexing for Long Document Retrieval," </w:t>
+      </w:r>
+      <w:proofErr w:type="spellStart"/>
+      <w:r>
+        <w:rPr>
+          <w:i/>
+          <w:iCs/>
+          <w:lang w:bidi="fa-IR"/>
+        </w:rPr>
+        <w:t>arXiv</w:t>
+      </w:r>
+      <w:proofErr w:type="spellEnd"/>
+      <w:r>
+        <w:rPr>
+          <w:i/>
+          <w:iCs/>
+          <w:lang w:bidi="fa-IR"/>
+        </w:rPr>
+        <w:t xml:space="preserve"> preprint arXiv:2404.15103</w:t>
+      </w:r>
+      <w:r>
+        <w:rPr>
+          <w:lang w:bidi="fa-IR"/>
+        </w:rPr>
+        <w:t>, 2024.</w:t>
+      </w:r>
+    </w:p>
+    <w:p>
+      <w:pPr>
+        <w:pStyle w:val="ListParagraph"/>
+        <w:bidi w:val="0"/>
+        <w:rPr>
+          <w:lang w:bidi="fa-IR"/>
+        </w:rPr>
+      </w:pPr>
+    </w:p>
+    <w:p>
+      <w:pPr>
+        <w:pStyle w:val="ListParagraph"/>
+        <w:numPr>
+          <w:ilvl w:val="0"/>
+          <w:numId w:val="22"/>
+        </w:numPr>
+        <w:bidi w:val="0"/>
+        <w:rPr>
+          <w:lang w:bidi="fa-IR"/>
+        </w:rPr>
+      </w:pPr>
+      <w:r>
+        <w:rPr>
+          <w:lang w:bidi="fa-IR"/>
+        </w:rPr>
+        <w:t>M. Guha, M. Alnasser, and S. V. S. P. K. R. Madipalli, "</w:t>
+      </w:r>
+      <w:proofErr w:type="spellStart"/>
+      <w:r>
+        <w:rPr>
+          <w:lang w:bidi="fa-IR"/>
+        </w:rPr>
+        <w:t>ChunkRAG</w:t>
+      </w:r>
+      <w:proofErr w:type="spellEnd"/>
+      <w:r>
+        <w:rPr>
+          <w:lang w:bidi="fa-IR"/>
+        </w:rPr>
+        <w:t>: Novel LLM-Chunk Filtering Method for RAG Systems," </w:t>
+      </w:r>
+      <w:proofErr w:type="spellStart"/>
+      <w:r>
+        <w:rPr>
+          <w:i/>
+          <w:iCs/>
+          <w:lang w:bidi="fa-IR"/>
+        </w:rPr>
+        <w:t>arXiv</w:t>
+      </w:r>
+      <w:proofErr w:type="spellEnd"/>
+      <w:r>
+        <w:rPr>
+          <w:i/>
+          <w:iCs/>
+          <w:lang w:bidi="fa-IR"/>
+        </w:rPr>
+        <w:t xml:space="preserve"> preprint arXiv:2410.19572</w:t>
+      </w:r>
+      <w:r>
+        <w:rPr>
+          <w:lang w:bidi="fa-IR"/>
+        </w:rPr>
+        <w:t>, 2024.</w:t>
+      </w:r>
+    </w:p>
+    <w:p>
+      <w:pPr>
+        <w:pStyle w:val="ListParagraph"/>
+        <w:bidi w:val="0"/>
+        <w:rPr>
+          <w:lang w:bidi="fa-IR"/>
+        </w:rPr>
+      </w:pPr>
+    </w:p>
+    <w:p>
+      <w:pPr>
+        <w:pStyle w:val="ListParagraph"/>
+        <w:numPr>
+          <w:ilvl w:val="0"/>
+          <w:numId w:val="22"/>
+        </w:numPr>
+        <w:bidi w:val="0"/>
+        <w:rPr>
+          <w:lang w:bidi="fa-IR"/>
+        </w:rPr>
+      </w:pPr>
+      <w:r>
+        <w:rPr>
+          <w:lang w:bidi="fa-IR"/>
+        </w:rPr>
+        <w:t>Y. Ma </w:t>
+      </w:r>
+      <w:r>
+        <w:rPr>
+          <w:i/>
+          <w:iCs/>
+          <w:lang w:bidi="fa-IR"/>
+        </w:rPr>
+        <w:t>et al.</w:t>
+      </w:r>
+      <w:r>
+        <w:rPr>
+          <w:lang w:bidi="fa-IR"/>
+        </w:rPr>
+        <w:t>, "</w:t>
+      </w:r>
+      <w:proofErr w:type="spellStart"/>
+      <w:r>
+        <w:rPr>
+          <w:lang w:bidi="fa-IR"/>
+        </w:rPr>
+        <w:t>CaseGNN</w:t>
+      </w:r>
+      <w:proofErr w:type="spellEnd"/>
+      <w:r>
+        <w:rPr>
+          <w:lang w:bidi="fa-IR"/>
+        </w:rPr>
+        <w:t>: Graph Neural Networks for Legal Case Retrieval with Text-Attributed Graphs," </w:t>
+      </w:r>
+      <w:proofErr w:type="spellStart"/>
+      <w:r>
+        <w:rPr>
+          <w:i/>
+          <w:iCs/>
+          <w:lang w:bidi="fa-IR"/>
+        </w:rPr>
+        <w:t>arXiv</w:t>
+      </w:r>
+      <w:proofErr w:type="spellEnd"/>
+      <w:r>
+        <w:rPr>
+          <w:i/>
+          <w:iCs/>
+          <w:lang w:bidi="fa-IR"/>
+        </w:rPr>
+        <w:t xml:space="preserve"> preprint arXiv:2312.11229</w:t>
+      </w:r>
+      <w:r>
+        <w:rPr>
+          <w:lang w:bidi="fa-IR"/>
+        </w:rPr>
+        <w:t>, 2023.​</w:t>
+      </w:r>
+    </w:p>
+    <w:p>
+      <w:pPr>
+        <w:pStyle w:val="ListParagraph"/>
+        <w:bidi w:val="0"/>
+        <w:rPr>
+          <w:lang w:bidi="fa-IR"/>
+        </w:rPr>
+      </w:pPr>
+    </w:p>
+    <w:p>
+      <w:pPr>
+        <w:pStyle w:val="ListParagraph"/>
+        <w:numPr>
+          <w:ilvl w:val="0"/>
+          <w:numId w:val="22"/>
+        </w:numPr>
+        <w:bidi w:val="0"/>
+        <w:rPr>
+          <w:lang w:bidi="fa-IR"/>
+        </w:rPr>
+      </w:pPr>
+      <w:r>
+        <w:rPr>
+          <w:lang w:bidi="fa-IR"/>
+        </w:rPr>
+        <w:t>Y. Ma </w:t>
+      </w:r>
+      <w:r>
+        <w:rPr>
+          <w:i/>
+          <w:iCs/>
+          <w:lang w:bidi="fa-IR"/>
+        </w:rPr>
+        <w:t>et al.</w:t>
+      </w:r>
+      <w:r>
+        <w:rPr>
+          <w:lang w:bidi="fa-IR"/>
+        </w:rPr>
+        <w:t>, "Financial Report Chunking for Effective Retrieval Augmented Generation," </w:t>
+      </w:r>
+      <w:proofErr w:type="spellStart"/>
+      <w:r>
+        <w:rPr>
+          <w:i/>
+          <w:iCs/>
+          <w:lang w:bidi="fa-IR"/>
+        </w:rPr>
+        <w:t>arXiv</w:t>
+      </w:r>
+      <w:proofErr w:type="spellEnd"/>
+      <w:r>
+        <w:rPr>
+          <w:i/>
+          <w:iCs/>
+          <w:lang w:bidi="fa-IR"/>
+        </w:rPr>
+        <w:t xml:space="preserve"> preprint arXiv:2402.05131</w:t>
+      </w:r>
+      <w:r>
+        <w:rPr>
+          <w:lang w:bidi="fa-IR"/>
+        </w:rPr>
+        <w:t>, 2024.</w:t>
+      </w:r>
+    </w:p>
+    <w:p>
+      <w:pPr>
+        <w:pStyle w:val="ListParagraph"/>
+        <w:rPr>
+          <w:lang w:bidi="fa-IR"/>
+        </w:rPr>
+      </w:pPr>
+    </w:p>
+    <w:p>
+      <w:pPr>
+        <w:pStyle w:val="ListParagraph"/>
+        <w:numPr>
+          <w:ilvl w:val="0"/>
+          <w:numId w:val="22"/>
+        </w:numPr>
+        <w:bidi w:val="0"/>
+        <w:rPr>
+          <w:lang w:bidi="fa-IR"/>
+        </w:rPr>
+      </w:pPr>
+      <w:r>
+        <w:rPr>
+          <w:lang w:bidi="fa-IR"/>
+        </w:rPr>
+        <w:t>J. Chen, S. Xiao, P. Zhang, K. Luo, D. Lian, and Z. Liu, "BGE M3-Embedding: Multi-Lingual, Multi-Functionality, Multi-Granularity Text Embeddings Through Self-Knowledge Distillation," </w:t>
+      </w:r>
+      <w:proofErr w:type="spellStart"/>
+      <w:r>
+        <w:rPr>
+          <w:i/>
+          <w:iCs/>
+          <w:lang w:bidi="fa-IR"/>
+        </w:rPr>
+        <w:t>arXiv</w:t>
+      </w:r>
+      <w:proofErr w:type="spellEnd"/>
+      <w:r>
+        <w:rPr>
+          <w:i/>
+          <w:iCs/>
+          <w:lang w:bidi="fa-IR"/>
+        </w:rPr>
+        <w:t xml:space="preserve"> preprint arXiv:2402.03216</w:t>
+      </w:r>
+      <w:r>
+        <w:rPr>
+          <w:lang w:bidi="fa-IR"/>
+        </w:rPr>
+        <w:t>, 2024.</w:t>
+      </w:r>
+    </w:p>
+    <w:p>
+      <w:pPr>
+        <w:bidi w:val="0"/>
+        <w:rPr>
+          <w:lang w:bidi="fa-IR"/>
+        </w:rPr>
+      </w:pPr>
+    </w:p>
+    <w:p>
+      <w:pPr>
+        <w:pStyle w:val="ListParagraph"/>
+        <w:numPr>
+          <w:ilvl w:val="0"/>
+          <w:numId w:val="22"/>
+        </w:numPr>
+        <w:bidi w:val="0"/>
+        <w:rPr>
+          <w:lang w:bidi="fa-IR"/>
+        </w:rPr>
+      </w:pPr>
+      <w:r>
+        <w:rPr>
+          <w:lang w:bidi="fa-IR"/>
+        </w:rPr>
+        <w:t>S. Xiao </w:t>
+      </w:r>
+      <w:r>
+        <w:rPr>
+          <w:i/>
+          <w:iCs/>
+          <w:lang w:bidi="fa-IR"/>
+        </w:rPr>
+        <w:t>et al.</w:t>
+      </w:r>
+      <w:r>
+        <w:rPr>
+          <w:lang w:bidi="fa-IR"/>
+        </w:rPr>
+        <w:t>, "RAPTOR: Recursive Abstractive Processing for Tree-Organized Retrieval," </w:t>
+      </w:r>
+      <w:proofErr w:type="spellStart"/>
+      <w:r>
+        <w:rPr>
+          <w:i/>
+          <w:iCs/>
+          <w:lang w:bidi="fa-IR"/>
+        </w:rPr>
+        <w:t>arXiv</w:t>
+      </w:r>
+      <w:proofErr w:type="spellEnd"/>
+      <w:r>
+        <w:rPr>
+          <w:i/>
+          <w:iCs/>
+          <w:lang w:bidi="fa-IR"/>
+        </w:rPr>
+        <w:t xml:space="preserve"> preprint arXiv:2401.18059</w:t>
+      </w:r>
+      <w:r>
+        <w:rPr>
+          <w:lang w:bidi="fa-IR"/>
+        </w:rPr>
+        <w:t>, 2024.</w:t>
+      </w:r>
+    </w:p>
+    <w:p>
+      <w:pPr>
+        <w:pStyle w:val="ListParagraph"/>
+        <w:rPr>
+          <w:lang w:bidi="fa-IR"/>
+        </w:rPr>
+      </w:pPr>
+    </w:p>
+    <w:p>
+      <w:pPr>
+        <w:pStyle w:val="ListParagraph"/>
+        <w:numPr>
+          <w:ilvl w:val="0"/>
+          <w:numId w:val="22"/>
+        </w:numPr>
+        <w:bidi w:val="0"/>
+        <w:rPr>
+          <w:lang w:bidi="fa-IR"/>
+        </w:rPr>
+      </w:pPr>
+      <w:r>
+        <w:rPr>
+          <w:lang w:bidi="fa-IR"/>
+        </w:rPr>
+        <w:t>X. Liu </w:t>
+      </w:r>
+      <w:r>
+        <w:rPr>
+          <w:i/>
+          <w:iCs/>
+          <w:lang w:bidi="fa-IR"/>
+        </w:rPr>
+        <w:t>et al.</w:t>
+      </w:r>
+      <w:r>
+        <w:rPr>
+          <w:lang w:bidi="fa-IR"/>
+        </w:rPr>
+        <w:t>, "CORAG: A Cost-Constrained Retrieval Optimization System for Retrieval-Augmented Generation," </w:t>
+      </w:r>
+      <w:proofErr w:type="spellStart"/>
+      <w:r>
+        <w:rPr>
+          <w:i/>
+          <w:iCs/>
+          <w:lang w:bidi="fa-IR"/>
+        </w:rPr>
+        <w:t>arXiv</w:t>
+      </w:r>
+      <w:proofErr w:type="spellEnd"/>
+      <w:r>
+        <w:rPr>
+          <w:i/>
+          <w:iCs/>
+          <w:lang w:bidi="fa-IR"/>
+        </w:rPr>
+        <w:t xml:space="preserve"> preprint arXiv:2411.00744</w:t>
+      </w:r>
+      <w:r>
+        <w:rPr>
+          <w:lang w:bidi="fa-IR"/>
+        </w:rPr>
+        <w:t>, 2024.</w:t>
+      </w:r>
+    </w:p>
+    <w:p>
+      <w:pPr>
+        <w:pStyle w:val="ListParagraph"/>
+        <w:rPr>
+          <w:lang w:bidi="fa-IR"/>
+        </w:rPr>
+      </w:pPr>
+    </w:p>
+    <w:p>
+      <w:pPr>
+        <w:pStyle w:val="ListParagraph"/>
+        <w:numPr>
+          <w:ilvl w:val="0"/>
+          <w:numId w:val="22"/>
+        </w:numPr>
+        <w:bidi w:val="0"/>
+        <w:rPr>
+          <w:lang w:bidi="fa-IR"/>
+        </w:rPr>
+      </w:pPr>
+      <w:r>
+        <w:rPr>
+          <w:i/>
+          <w:iCs/>
+          <w:lang w:bidi="fa-IR"/>
+        </w:rPr>
+        <w:t>J. Liu et al., "Boosting RAG: Picking Brains Before Searching," </w:t>
+      </w:r>
+      <w:proofErr w:type="spellStart"/>
+      <w:r>
+        <w:rPr>
+          <w:i/>
+          <w:iCs/>
+          <w:lang w:bidi="fa-IR"/>
+        </w:rPr>
+        <w:t>arXiv</w:t>
+      </w:r>
+      <w:proofErr w:type="spellEnd"/>
+      <w:r>
+        <w:rPr>
+          <w:i/>
+          <w:iCs/>
+          <w:lang w:bidi="fa-IR"/>
+        </w:rPr>
+        <w:t xml:space="preserve"> preprint arXiv:2410.13220, 2024.</w:t>
+      </w:r>
+    </w:p>
+    <w:p>
+      <w:pPr>
+        <w:pStyle w:val="ListParagraph"/>
+        <w:rPr>
+          <w:lang w:bidi="fa-IR"/>
+        </w:rPr>
+      </w:pPr>
+    </w:p>
+    <w:p>
+      <w:pPr>
+        <w:pStyle w:val="ListParagraph"/>
+        <w:numPr>
+          <w:ilvl w:val="0"/>
+          <w:numId w:val="22"/>
+        </w:numPr>
+        <w:bidi w:val="0"/>
+        <w:rPr>
+          <w:lang w:bidi="fa-IR"/>
+        </w:rPr>
+      </w:pPr>
+      <w:r>
+        <w:rPr>
+          <w:i/>
+          <w:iCs/>
+          <w:lang w:bidi="fa-IR"/>
+        </w:rPr>
+        <w:t>Z. Izadi et al., "Persian-</w:t>
+      </w:r>
+      <w:proofErr w:type="spellStart"/>
+      <w:r>
+        <w:rPr>
+          <w:i/>
+          <w:iCs/>
+          <w:lang w:bidi="fa-IR"/>
+        </w:rPr>
+        <w:t>LeX</w:t>
+      </w:r>
+      <w:proofErr w:type="spellEnd"/>
+      <w:r>
+        <w:rPr>
+          <w:i/>
+          <w:iCs/>
+          <w:lang w:bidi="fa-IR"/>
+        </w:rPr>
+        <w:t>: A Gold-Standard Legal Information Retrieval Dataset for Persian," in Proceedings of the 2023 Conference on Empirical Methods in Natural Language Processing, 2023, pp. 11003–11014.</w:t>
+      </w:r>
+    </w:p>
+    <w:p>
+      <w:pPr>
+        <w:pStyle w:val="ListParagraph"/>
+        <w:rPr>
+          <w:lang w:bidi="fa-IR"/>
+        </w:rPr>
+      </w:pPr>
+    </w:p>
+    <w:p>
+      <w:pPr>
+        <w:pStyle w:val="ListParagraph"/>
+        <w:numPr>
+          <w:ilvl w:val="0"/>
+          <w:numId w:val="22"/>
+        </w:numPr>
+        <w:bidi w:val="0"/>
+        <w:rPr>
+          <w:lang w:bidi="fa-IR"/>
+        </w:rPr>
+      </w:pPr>
+      <w:r>
+        <w:rPr>
+          <w:i/>
+          <w:iCs/>
+          <w:lang w:bidi="fa-IR"/>
+        </w:rPr>
+        <w:t>Z. Yu et al., "Chain-of-Note: Enhancing Robustness in Retrieval-Augmented Language Models," </w:t>
+      </w:r>
+      <w:proofErr w:type="spellStart"/>
+      <w:r>
+        <w:rPr>
+          <w:i/>
+          <w:iCs/>
+          <w:lang w:bidi="fa-IR"/>
+        </w:rPr>
+        <w:t>arXiv</w:t>
+      </w:r>
+      <w:proofErr w:type="spellEnd"/>
+      <w:r>
+        <w:rPr>
+          <w:i/>
+          <w:iCs/>
+          <w:lang w:bidi="fa-IR"/>
+        </w:rPr>
+        <w:t xml:space="preserve"> preprint arXiv:2311.09210, 2023.</w:t>
+      </w:r>
+    </w:p>
+    <w:p>
+      <w:pPr>
+        <w:pStyle w:val="ListParagraph"/>
+        <w:rPr>
+          <w:lang w:bidi="fa-IR"/>
+        </w:rPr>
+      </w:pPr>
+    </w:p>
+    <w:p>
+      <w:pPr>
+        <w:pStyle w:val="ListParagraph"/>
+        <w:numPr>
+          <w:ilvl w:val="0"/>
+          <w:numId w:val="22"/>
+        </w:numPr>
+        <w:bidi w:val="0"/>
+        <w:rPr>
+          <w:lang w:bidi="fa-IR"/>
+        </w:rPr>
+      </w:pPr>
+      <w:r>
+        <w:rPr>
+          <w:i/>
+          <w:iCs/>
+          <w:lang w:bidi="fa-IR"/>
+        </w:rPr>
+        <w:t>N. F. Liu, K. Lin, J. Hewitt, A. Paranjape, M. Bevilacqua, F. Petroni, and P. Liang, "Lost in the Middle: How Language Models Use Long Contexts," Transactions of the Association for Computational Linguistics, vol. 12, pp. 157–173, 2024.</w:t>
+      </w:r>
+    </w:p>
+    <w:p>
+      <w:pPr>
+        <w:pStyle w:val="ListParagraph"/>
+        <w:rPr>
+          <w:lang w:bidi="fa-IR"/>
+        </w:rPr>
+      </w:pPr>
+    </w:p>
+    <w:p>
+      <w:pPr>
+        <w:pStyle w:val="ListParagraph"/>
+        <w:numPr>
+          <w:ilvl w:val="0"/>
+          <w:numId w:val="22"/>
+        </w:numPr>
+        <w:bidi w:val="0"/>
+        <w:rPr>
+          <w:lang w:bidi="fa-IR"/>
+        </w:rPr>
+      </w:pPr>
+      <w:r>
+        <w:rPr>
+          <w:i/>
+          <w:iCs/>
+          <w:lang w:bidi="fa-IR"/>
+        </w:rPr>
+        <w:t xml:space="preserve">R. Thakur, N. Reimers, A. </w:t>
+      </w:r>
+      <w:proofErr w:type="spellStart"/>
+      <w:r>
+        <w:rPr>
+          <w:i/>
+          <w:iCs/>
+          <w:lang w:bidi="fa-IR"/>
+        </w:rPr>
+        <w:t>Rücklé</w:t>
+      </w:r>
+      <w:proofErr w:type="spellEnd"/>
+      <w:r>
+        <w:rPr>
+          <w:i/>
+          <w:iCs/>
+          <w:lang w:bidi="fa-IR"/>
+        </w:rPr>
+        <w:t xml:space="preserve">, A. Srivastava, and I. </w:t>
+      </w:r>
+      <w:proofErr w:type="spellStart"/>
+      <w:r>
+        <w:rPr>
+          <w:i/>
+          <w:iCs/>
+          <w:lang w:bidi="fa-IR"/>
+        </w:rPr>
+        <w:t>Gurevych</w:t>
+      </w:r>
+      <w:proofErr w:type="spellEnd"/>
+      <w:r>
+        <w:rPr>
+          <w:i/>
+          <w:iCs/>
+          <w:lang w:bidi="fa-IR"/>
+        </w:rPr>
+        <w:t>, "BEIR: A Heterogeneous Benchmark for Zero-shot Evaluation of Information Retrieval Models," in Proceedings of the Neural Information Processing Systems (</w:t>
+      </w:r>
+      <w:proofErr w:type="spellStart"/>
+      <w:r>
+        <w:rPr>
+          <w:i/>
+          <w:iCs/>
+          <w:lang w:bidi="fa-IR"/>
+        </w:rPr>
+        <w:t>NeurIPS</w:t>
+      </w:r>
+      <w:proofErr w:type="spellEnd"/>
+      <w:r>
+        <w:rPr>
+          <w:i/>
+          <w:iCs/>
+          <w:lang w:bidi="fa-IR"/>
+        </w:rPr>
+        <w:t>), Datasets and Benchmarks Track, 2021.</w:t>
+      </w:r>
+    </w:p>
+    <w:p>
+      <w:pPr>
+        <w:pStyle w:val="ListParagraph"/>
+        <w:rPr>
+          <w:lang w:bidi="fa-IR"/>
+        </w:rPr>
+      </w:pPr>
+    </w:p>
+    <w:p>
+      <w:pPr>
+        <w:pStyle w:val="ListParagraph"/>
+        <w:numPr>
+          <w:ilvl w:val="0"/>
+          <w:numId w:val="22"/>
+        </w:numPr>
+        <w:bidi w:val="0"/>
+        <w:rPr>
+          <w:lang w:bidi="fa-IR"/>
+        </w:rPr>
+      </w:pPr>
+      <w:r>
+        <w:rPr>
+          <w:i/>
+          <w:iCs/>
+          <w:lang w:bidi="fa-IR"/>
+        </w:rPr>
+        <w:t>J. Li et al., "Found in the Middle: Calibrating Positional Attention Bias Improves Long Context Utilization," </w:t>
+      </w:r>
+      <w:proofErr w:type="spellStart"/>
+      <w:r>
+        <w:rPr>
+          <w:i/>
+          <w:iCs/>
+          <w:lang w:bidi="fa-IR"/>
+        </w:rPr>
+        <w:t>arXiv</w:t>
+      </w:r>
+      <w:proofErr w:type="spellEnd"/>
+      <w:r>
+        <w:rPr>
+          <w:i/>
+          <w:iCs/>
+          <w:lang w:bidi="fa-IR"/>
+        </w:rPr>
+        <w:t xml:space="preserve"> preprint arXiv:2406.16008, 2024.</w:t>
+      </w:r>
+    </w:p>
+    <w:p>
+      <w:pPr>
+        <w:pStyle w:val="ListParagraph"/>
+        <w:rPr>
+          <w:lang w:bidi="fa-IR"/>
+        </w:rPr>
+      </w:pPr>
+    </w:p>
+    <w:p>
+      <w:pPr>
+        <w:pStyle w:val="ListParagraph"/>
+        <w:numPr>
+          <w:ilvl w:val="0"/>
+          <w:numId w:val="22"/>
+        </w:numPr>
+        <w:bidi w:val="0"/>
+        <w:rPr>
+          <w:lang w:bidi="fa-IR"/>
+        </w:rPr>
+      </w:pPr>
+      <w:r>
+        <w:rPr>
+          <w:i/>
+          <w:iCs/>
+          <w:lang w:bidi="fa-IR"/>
+        </w:rPr>
+        <w:t>P. Lewis et al., "Retrieval-Augmented Generation for Knowledge-Intensive NLP Tasks," in Advances in Neural Information Processing Systems (</w:t>
+      </w:r>
+      <w:proofErr w:type="spellStart"/>
+      <w:r>
+        <w:rPr>
+          <w:i/>
+          <w:iCs/>
+          <w:lang w:bidi="fa-IR"/>
+        </w:rPr>
+        <w:t>NeurIPS</w:t>
+      </w:r>
+      <w:proofErr w:type="spellEnd"/>
+      <w:r>
+        <w:rPr>
+          <w:i/>
+          <w:iCs/>
+          <w:lang w:bidi="fa-IR"/>
+        </w:rPr>
+        <w:t>), vol. 33, pp. 9459–9474, 2020.</w:t>
+      </w:r>
+    </w:p>
+    <w:p>
+      <w:pPr>
+        <w:pStyle w:val="ListParagraph"/>
+        <w:rPr>
+          <w:lang w:bidi="fa-IR"/>
+        </w:rPr>
+      </w:pPr>
+    </w:p>
+    <w:p>
+      <w:pPr>
+        <w:pStyle w:val="ListParagraph"/>
+        <w:numPr>
+          <w:ilvl w:val="0"/>
+          <w:numId w:val="22"/>
+        </w:numPr>
+        <w:bidi w:val="0"/>
+        <w:rPr>
+          <w:lang w:bidi="fa-IR"/>
+        </w:rPr>
+      </w:pPr>
+      <w:r>
+        <w:rPr>
+          <w:i/>
+          <w:iCs/>
+          <w:lang w:bidi="fa-IR"/>
+        </w:rPr>
+        <w:t>A. Mallen et al., "When Not to Trust Language Models: Investigating Effectiveness of Parametric and Non-Parametric Memories," in Proceedings of the 61st Annual Meeting of the Association for Computational Linguistics (ACL), 2023, pp. 9802–9822.</w:t>
+      </w:r>
+    </w:p>
+    <w:p>
+      <w:pPr>
+        <w:bidi w:val="0"/>
+        <w:rPr>
+          <w:lang w:bidi="fa-IR"/>
+        </w:rPr>
+      </w:pPr>
+    </w:p>
+    <w:p>
+      <w:pPr>
+        <w:pStyle w:val="ListParagraph"/>
+        <w:numPr>
+          <w:ilvl w:val="0"/>
+          <w:numId w:val="22"/>
+        </w:numPr>
+        <w:bidi w:val="0"/>
+        <w:rPr>
+          <w:lang w:bidi="fa-IR"/>
+        </w:rPr>
+      </w:pPr>
+      <w:r>
+        <w:rPr>
+          <w:i/>
+          <w:iCs/>
+          <w:lang w:bidi="fa-IR"/>
+        </w:rPr>
+        <w:t>H. Chen et al., "</w:t>
+      </w:r>
+      <w:proofErr w:type="spellStart"/>
+      <w:r>
+        <w:rPr>
+          <w:i/>
+          <w:iCs/>
+          <w:lang w:bidi="fa-IR"/>
+        </w:rPr>
+        <w:t>FrugalGPT</w:t>
+      </w:r>
+      <w:proofErr w:type="spellEnd"/>
+      <w:r>
+        <w:rPr>
+          <w:i/>
+          <w:iCs/>
+          <w:lang w:bidi="fa-IR"/>
+        </w:rPr>
+        <w:t>: How to Use Large Language Models While Reducing Cost and Improving Performance," </w:t>
+      </w:r>
+      <w:proofErr w:type="spellStart"/>
+      <w:r>
+        <w:rPr>
+          <w:i/>
+          <w:iCs/>
+          <w:lang w:bidi="fa-IR"/>
+        </w:rPr>
+        <w:t>arXiv</w:t>
+      </w:r>
+      <w:proofErr w:type="spellEnd"/>
+      <w:r>
+        <w:rPr>
+          <w:i/>
+          <w:iCs/>
+          <w:lang w:bidi="fa-IR"/>
+        </w:rPr>
+        <w:t xml:space="preserve"> preprint arXiv:2305.05176, 2023.</w:t>
       </w:r>
     </w:p>
     <w:sectPr>
@@ -1760,7 +3023,6 @@
   <w:style w:type="character" w:default="1" w:styleId="DefaultParagraphFont">
     <w:name w:val="Default Paragraph Font"/>
     <w:uiPriority w:val="1"/>
-    <w:semiHidden/>
     <w:unhideWhenUsed/>
   </w:style>
   <w:style w:type="table" w:default="1" w:styleId="TableNormal">

</xml_diff>